<commit_message>
docs: Appended 89.1% ML Accuracy and Stage 2 Semantic upgrade specifications to Graduation Project Documents
</commit_message>
<xml_diff>
--- a/Bixah Ultimate Documentation.docx
+++ b/Bixah Ultimate Documentation.docx
@@ -7962,6 +7962,59 @@
           <w:iCs/>
         </w:rPr>
         <w:t xml:space="preserve"> To combat adversarial string forging, the next generation of the Bixah engine must transition beyond pure text arrays and incorporate Computer Vision. By integrating a Convolutional Neural Network (CNN) or a deep-learning object detection pipeline (such as YOLO), the system could autonomously spin up a headless browser (like Selenium), navigate to the suspicious endpoint, and visually parse the HTML rendering. The CNN could then actively identify the pixel structure of deceptive Microsoft Office 365 or PayPal login forms entirely independently of what the URL string is named, creating an impenetrable biometric defense.</w:t>
+      </w:r>
+    </w:p>
+    <w:p>
+      <w:pPr>
+        <w:pStyle w:val="Heading1"/>
+      </w:pPr>
+      <w:r>
+        <w:t>March 2026 Model Update Appendix</w:t>
+      </w:r>
+    </w:p>
+    <w:p>
+      <w:r>
+        <w:t>The Stage 2 Machine Learning engine and Stage 1 Text Analyzers were aggressively retrained on 1,000,000 URLs, achieving the new 89.1% offline ML accuracy threshold.</w:t>
+      </w:r>
+    </w:p>
+    <w:p>
+      <w:pPr>
+        <w:pStyle w:val="Heading2"/>
+      </w:pPr>
+      <w:r>
+        <w:t>Newly Engineered NLP Features</w:t>
+      </w:r>
+    </w:p>
+    <w:p>
+      <w:pPr>
+        <w:pStyle w:val="ListBullet"/>
+      </w:pPr>
+      <w:r>
+        <w:t>Vowel-to-Consonant Ratio: Detects highly obfuscated mathematical botnet links and gibberish hashes.</w:t>
+      </w:r>
+    </w:p>
+    <w:p>
+      <w:pPr>
+        <w:pStyle w:val="ListBullet"/>
+      </w:pPr>
+      <w:r>
+        <w:t>Exploded Threat Keywords: Separate logic tracking for 'scam', 'login', and 'finance' intent strings.</w:t>
+      </w:r>
+    </w:p>
+    <w:p>
+      <w:pPr>
+        <w:pStyle w:val="ListBullet"/>
+      </w:pPr>
+      <w:r>
+        <w:t>Structural Token Length Limits: Identifies massively long hidden subdomains masking the true URL destination.</w:t>
+      </w:r>
+    </w:p>
+    <w:p>
+      <w:pPr>
+        <w:pStyle w:val="ListBullet"/>
+      </w:pPr>
+      <w:r>
+        <w:t>TF-IDF Vocabulary Expansion: Pushed the Stage 1 text memorization limits to 150,000 text sequences using 7-character chunking mechanisms.</w:t>
       </w:r>
     </w:p>
     <w:sectPr>

</xml_diff>